<commit_message>
docs(fase-2): lámina 8 alternativa simplificada de requerimientos
Se agrega una versión simplificada de la lámina de requerimientos justo
después de la actual, con una línea por capa, la cuenta y el grupo, y
cuatro atributos de calidad. Lleva una marca "Alternativa simplificada"
fácil de borrar. Se presenta solo una de las dos, con el mismo texto y
los mismos 22 segundos.

Quedan 18 láminas. Los guiones se renumeran y el de Jorge indica que la
7 y la 8 son alternativas. Los tiempos no cambian: 9:30 en total.

Co-Authored-By: Claude Opus 5.5 <noreply@anthropic.com>
</commit_message>
<xml_diff>
--- a/Fase 2/Evidencias Proyecto/Guion_Jorge_Fase2.docx
+++ b/Fase 2/Evidencias Proyecto/Guion_Jorge_Fase2.docx
@@ -99,7 +99,7 @@
                 <w:bCs w:val="false"/>
                 <w:color w:val="13252A"/>
               </w:rPr>
-              <w:t xml:space="preserve">1 a 13, de la portada al modelo de negocio</w:t>
+              <w:t xml:space="preserve">1 a 14, de la portada al modelo de negocio. La 7 y la 8 son alternativas: se presenta solo una</w:t>
             </w:r>
           </w:p>
         </w:tc>
@@ -297,7 +297,7 @@
                 <w:bCs w:val="false"/>
                 <w:color w:val="13252A"/>
               </w:rPr>
-              <w:t xml:space="preserve">Martín, al final de la lámina 13: «Martín les va a mostrar MATU funcionando»</w:t>
+              <w:t xml:space="preserve">Martín, al final de la lámina 14: «Martín les va a mostrar MATU funcionando»</w:t>
             </w:r>
           </w:p>
         </w:tc>
@@ -313,7 +313,7 @@
           <w:iCs/>
           <w:color w:val="485B5F"/>
         </w:rPr>
-        <w:t xml:space="preserve">Frases cortas, para decirlas y no leerlas. La lámina muestra más de lo que dices: di lo de «Destaca» y deja que el público lea el resto. Si vas atrasado, recorta las láminas 7, 8 y 10, nunca la 3 ni la 11.</w:t>
+        <w:t xml:space="preserve">Frases cortas, para decirlas y no leerlas. La lámina muestra más de lo que dices: di lo de «Destaca» y deja que el público lea el resto. Si vas atrasado, recorta las láminas 7 u 8, 9 y 11, nunca la 3 ni la 12.</w:t>
       </w:r>
     </w:p>
     <w:p>
@@ -1041,7 +1041,7 @@
                 <w:bCs w:val="false"/>
                 <w:color w:val="13252A"/>
               </w:rPr>
-              <w:t xml:space="preserve">7 · Requerimientos funcionales y no funcionales</w:t>
+              <w:t xml:space="preserve">7 u 8 · Requerimientos funcionales y no funcionales (alternativas)</w:t>
             </w:r>
           </w:p>
         </w:tc>
@@ -1136,7 +1136,7 @@
                 <w:bCs w:val="false"/>
                 <w:color w:val="13252A"/>
               </w:rPr>
-              <w:t xml:space="preserve">8 · Scrum en sprints de una semana</w:t>
+              <w:t xml:space="preserve">9 · Scrum en sprints de una semana</w:t>
             </w:r>
           </w:p>
         </w:tc>
@@ -1231,7 +1231,7 @@
                 <w:bCs w:val="false"/>
                 <w:color w:val="13252A"/>
               </w:rPr>
-              <w:t xml:space="preserve">9 · Cinco sprints de construcción y dos de reserva</w:t>
+              <w:t xml:space="preserve">10 · Cinco sprints de construcción y dos de reserva</w:t>
             </w:r>
           </w:p>
         </w:tc>
@@ -1326,7 +1326,7 @@
                 <w:bCs w:val="false"/>
                 <w:color w:val="13252A"/>
               </w:rPr>
-              <w:t xml:space="preserve">10 · Un stack conocido y documentado</w:t>
+              <w:t xml:space="preserve">11 · Un stack conocido y documentado</w:t>
             </w:r>
           </w:p>
         </w:tc>
@@ -1421,7 +1421,7 @@
                 <w:bCs w:val="false"/>
                 <w:color w:val="13252A"/>
               </w:rPr>
-              <w:t xml:space="preserve">11 · Un monolito modular, con las dependencias hacia abajo</w:t>
+              <w:t xml:space="preserve">12 · Un monolito modular, con las dependencias hacia abajo</w:t>
             </w:r>
           </w:p>
         </w:tc>
@@ -1516,7 +1516,7 @@
                 <w:bCs w:val="false"/>
                 <w:color w:val="13252A"/>
               </w:rPr>
-              <w:t xml:space="preserve">12 · Todo cuelga del grupo familiar</w:t>
+              <w:t xml:space="preserve">13 · Todo cuelga del grupo familiar</w:t>
             </w:r>
           </w:p>
         </w:tc>
@@ -1611,7 +1611,7 @@
                 <w:bCs w:val="false"/>
                 <w:color w:val="13252A"/>
               </w:rPr>
-              <w:t xml:space="preserve">13 · Suscripción más despacho: 84 familias para el equilibrio</w:t>
+              <w:t xml:space="preserve">14 · Suscripción más despacho: 84 familias para el equilibrio</w:t>
             </w:r>
           </w:p>
         </w:tc>
@@ -2082,7 +2082,7 @@
         <w:t xml:space="preserve">Salta: </w:t>
       </w:r>
       <w:r>
-        <w:t xml:space="preserve">La lista de lo que queda fuera: vuelve en la lámina 15.</w:t>
+        <w:t xml:space="preserve">La lista de lo que queda fuera: vuelve en la lámina 16.</w:t>
       </w:r>
     </w:p>
     <w:p>
@@ -2092,7 +2092,7 @@
         <w:spacing w:after="60" w:before="260"/>
       </w:pPr>
       <w:r>
-        <w:t xml:space="preserve">Lámina 7 · Requerimientos funcionales y no funcionales</w:t>
+        <w:t xml:space="preserve">Lámina 7 u 8 · Requerimientos funcionales y no funcionales</w:t>
       </w:r>
     </w:p>
     <w:p>
@@ -2107,6 +2107,19 @@
           <w:color w:val="485B5F"/>
         </w:rPr>
         <w:t xml:space="preserve">22 s · al terminar vas en 2:30</w:t>
+      </w:r>
+    </w:p>
+    <w:p>
+      <w:pPr>
+        <w:spacing w:after="120" w:line="300"/>
+      </w:pPr>
+      <w:r>
+        <w:rPr>
+          <w:i/>
+          <w:iCs/>
+          <w:color w:val="086764"/>
+        </w:rPr>
+        <w:t xml:space="preserve">Las láminas 7 y 8 son alternativas: la 8 es la versión simplificada. Se presenta solo una, con este mismo texto y el mismo tiempo.</w:t>
       </w:r>
     </w:p>
     <w:p>
@@ -2160,7 +2173,7 @@
         <w:spacing w:after="60" w:before="260"/>
       </w:pPr>
       <w:r>
-        <w:t xml:space="preserve">Lámina 8 · Scrum en sprints de una semana</w:t>
+        <w:t xml:space="preserve">Lámina 9 · Scrum en sprints de una semana</w:t>
       </w:r>
     </w:p>
     <w:p>
@@ -2228,7 +2241,7 @@
         <w:spacing w:after="60" w:before="260"/>
       </w:pPr>
       <w:r>
-        <w:t xml:space="preserve">Lámina 9 · Cinco sprints de construcción y dos de reserva</w:t>
+        <w:t xml:space="preserve">Lámina 10 · Cinco sprints de construcción y dos de reserva</w:t>
       </w:r>
     </w:p>
     <w:p>
@@ -2296,7 +2309,7 @@
         <w:spacing w:after="60" w:before="260"/>
       </w:pPr>
       <w:r>
-        <w:t xml:space="preserve">Lámina 10 · Un stack conocido y documentado</w:t>
+        <w:t xml:space="preserve">Lámina 11 · Un stack conocido y documentado</w:t>
       </w:r>
     </w:p>
     <w:p>
@@ -2364,7 +2377,7 @@
         <w:spacing w:after="60" w:before="260"/>
       </w:pPr>
       <w:r>
-        <w:t xml:space="preserve">Lámina 11 · Un monolito modular, con las dependencias hacia abajo</w:t>
+        <w:t xml:space="preserve">Lámina 12 · Un monolito modular, con las dependencias hacia abajo</w:t>
       </w:r>
     </w:p>
     <w:p>
@@ -2432,7 +2445,7 @@
         <w:spacing w:after="60" w:before="260"/>
       </w:pPr>
       <w:r>
-        <w:t xml:space="preserve">Lámina 12 · Todo cuelga del grupo familiar</w:t>
+        <w:t xml:space="preserve">Lámina 13 · Todo cuelga del grupo familiar</w:t>
       </w:r>
     </w:p>
     <w:p>
@@ -2500,7 +2513,7 @@
         <w:spacing w:after="60" w:before="260"/>
       </w:pPr>
       <w:r>
-        <w:t xml:space="preserve">Lámina 13 · Suscripción más despacho: 84 familias para el equilibrio</w:t>
+        <w:t xml:space="preserve">Lámina 14 · Suscripción más despacho: 84 familias para el equilibrio</w:t>
       </w:r>
     </w:p>
     <w:p>

</xml_diff>

<commit_message>
docs(fase-2): queda solo la lámina simplificada de requerimientos
Jorge eligió la versión simplificada. Se borra la lámina 7 original en el
generador, la simplificada pasa a ser la 7, sin la etiqueta "Alternativa
simplificada" ni la marca de alternativa en su nota. Vuelven a ser 17
láminas: Jorge de la 1 a la 13 y Martín la 14 (demo) y de la 15 a la 17.
Los dos guiones se renumeran. Los tiempos no cambian (9:30).

Co-Authored-By: Claude Opus 5.5 <noreply@anthropic.com>
</commit_message>
<xml_diff>
--- a/Fase 2/Evidencias Proyecto/Guion_Jorge_Fase2.docx
+++ b/Fase 2/Evidencias Proyecto/Guion_Jorge_Fase2.docx
@@ -99,7 +99,7 @@
                 <w:bCs w:val="false"/>
                 <w:color w:val="13252A"/>
               </w:rPr>
-              <w:t xml:space="preserve">1 a 14, de la portada al modelo de negocio. La 7 y la 8 son alternativas: se presenta solo una</w:t>
+              <w:t xml:space="preserve">1 a 13, de la portada al modelo de negocio</w:t>
             </w:r>
           </w:p>
         </w:tc>
@@ -297,7 +297,7 @@
                 <w:bCs w:val="false"/>
                 <w:color w:val="13252A"/>
               </w:rPr>
-              <w:t xml:space="preserve">Martín, al final de la lámina 14: «Martín les va a mostrar MATU funcionando»</w:t>
+              <w:t xml:space="preserve">Martín, al final de la lámina 13: «Martín les va a mostrar MATU funcionando»</w:t>
             </w:r>
           </w:p>
         </w:tc>
@@ -313,7 +313,7 @@
           <w:iCs/>
           <w:color w:val="485B5F"/>
         </w:rPr>
-        <w:t xml:space="preserve">Frases cortas, para decirlas y no leerlas. La lámina muestra más de lo que dices: di lo de «Destaca» y deja que el público lea el resto. Si vas atrasado, recorta las láminas 7 u 8, 9 y 11, nunca la 3 ni la 12.</w:t>
+        <w:t xml:space="preserve">Frases cortas, para decirlas y no leerlas. La lámina muestra más de lo que dices: di lo de «Destaca» y deja que el público lea el resto. Si vas atrasado, recorta las láminas 7, 8 y 10, nunca la 3 ni la 11.</w:t>
       </w:r>
     </w:p>
     <w:p>
@@ -1041,7 +1041,7 @@
                 <w:bCs w:val="false"/>
                 <w:color w:val="13252A"/>
               </w:rPr>
-              <w:t xml:space="preserve">7 u 8 · Requerimientos funcionales y no funcionales (alternativas)</w:t>
+              <w:t xml:space="preserve">7 · Requerimientos funcionales y no funcionales</w:t>
             </w:r>
           </w:p>
         </w:tc>
@@ -1136,7 +1136,7 @@
                 <w:bCs w:val="false"/>
                 <w:color w:val="13252A"/>
               </w:rPr>
-              <w:t xml:space="preserve">9 · Scrum en sprints de una semana</w:t>
+              <w:t xml:space="preserve">8 · Scrum en sprints de una semana</w:t>
             </w:r>
           </w:p>
         </w:tc>
@@ -1231,7 +1231,7 @@
                 <w:bCs w:val="false"/>
                 <w:color w:val="13252A"/>
               </w:rPr>
-              <w:t xml:space="preserve">10 · Cinco sprints de construcción y dos de reserva</w:t>
+              <w:t xml:space="preserve">9 · Cinco sprints de construcción y dos de reserva</w:t>
             </w:r>
           </w:p>
         </w:tc>
@@ -1326,7 +1326,7 @@
                 <w:bCs w:val="false"/>
                 <w:color w:val="13252A"/>
               </w:rPr>
-              <w:t xml:space="preserve">11 · Un stack conocido y documentado</w:t>
+              <w:t xml:space="preserve">10 · Un stack conocido y documentado</w:t>
             </w:r>
           </w:p>
         </w:tc>
@@ -1421,7 +1421,7 @@
                 <w:bCs w:val="false"/>
                 <w:color w:val="13252A"/>
               </w:rPr>
-              <w:t xml:space="preserve">12 · Un monolito modular, con las dependencias hacia abajo</w:t>
+              <w:t xml:space="preserve">11 · Un monolito modular, con las dependencias hacia abajo</w:t>
             </w:r>
           </w:p>
         </w:tc>
@@ -1516,7 +1516,7 @@
                 <w:bCs w:val="false"/>
                 <w:color w:val="13252A"/>
               </w:rPr>
-              <w:t xml:space="preserve">13 · Todo cuelga del grupo familiar</w:t>
+              <w:t xml:space="preserve">12 · Todo cuelga del grupo familiar</w:t>
             </w:r>
           </w:p>
         </w:tc>
@@ -1611,7 +1611,7 @@
                 <w:bCs w:val="false"/>
                 <w:color w:val="13252A"/>
               </w:rPr>
-              <w:t xml:space="preserve">14 · Suscripción más despacho: 84 familias para el equilibrio</w:t>
+              <w:t xml:space="preserve">13 · Suscripción más despacho: 84 familias para el equilibrio</w:t>
             </w:r>
           </w:p>
         </w:tc>
@@ -2082,7 +2082,7 @@
         <w:t xml:space="preserve">Salta: </w:t>
       </w:r>
       <w:r>
-        <w:t xml:space="preserve">La lista de lo que queda fuera: vuelve en la lámina 16.</w:t>
+        <w:t xml:space="preserve">La lista de lo que queda fuera: vuelve en la lámina 15.</w:t>
       </w:r>
     </w:p>
     <w:p>
@@ -2092,7 +2092,7 @@
         <w:spacing w:after="60" w:before="260"/>
       </w:pPr>
       <w:r>
-        <w:t xml:space="preserve">Lámina 7 u 8 · Requerimientos funcionales y no funcionales</w:t>
+        <w:t xml:space="preserve">Lámina 7 · Requerimientos funcionales y no funcionales</w:t>
       </w:r>
     </w:p>
     <w:p>
@@ -2114,20 +2114,27 @@
         <w:spacing w:after="120" w:line="300"/>
       </w:pPr>
       <w:r>
-        <w:rPr>
-          <w:i/>
-          <w:iCs/>
+        <w:t xml:space="preserve">«De 42 requerimientos funcionales, 26 son obligatorios, ordenados por capa. Los no funcionales son seis atributos medibles. El primero: ningún pago sin registrar. Y la accesibilidad es requisito: una persona de 68 años completa la ficha en menos de tres minutos.»</w:t>
+      </w:r>
+    </w:p>
+    <w:p>
+      <w:pPr>
+        <w:spacing w:after="80" w:line="290"/>
+      </w:pPr>
+      <w:r>
+        <w:rPr>
+          <w:b/>
+          <w:bCs/>
           <w:color w:val="086764"/>
         </w:rPr>
-        <w:t xml:space="preserve">Las láminas 7 y 8 son alternativas: la 8 es la versión simplificada. Se presenta solo una, con este mismo texto y el mismo tiempo.</w:t>
-      </w:r>
-    </w:p>
-    <w:p>
-      <w:pPr>
-        <w:spacing w:after="120" w:line="300"/>
-      </w:pPr>
-      <w:r>
-        <w:t xml:space="preserve">«De 42 requerimientos funcionales, 26 son obligatorios, ordenados por capa. Los no funcionales son seis atributos medibles. El primero: ningún pago sin registrar. Y la accesibilidad es requisito: una persona de 68 años completa la ficha en menos de tres minutos.»</w:t>
+        <w:t xml:space="preserve">Destaca: </w:t>
+      </w:r>
+      <w:r>
+        <w:rPr>
+          <w:b/>
+          <w:bCs/>
+        </w:rPr>
+        <w:t xml:space="preserve">26 de 42. La accesibilidad es requisito.</w:t>
       </w:r>
     </w:p>
     <w:p>
@@ -2140,30 +2147,10 @@
           <w:bCs/>
           <w:color w:val="086764"/>
         </w:rPr>
-        <w:t xml:space="preserve">Destaca: </w:t>
-      </w:r>
-      <w:r>
-        <w:rPr>
-          <w:b/>
-          <w:bCs/>
-        </w:rPr>
-        <w:t xml:space="preserve">26 de 42. La accesibilidad es requisito.</w:t>
-      </w:r>
-    </w:p>
-    <w:p>
-      <w:pPr>
-        <w:spacing w:after="80" w:line="290"/>
-      </w:pPr>
-      <w:r>
-        <w:rPr>
-          <w:b/>
-          <w:bCs/>
-          <w:color w:val="086764"/>
-        </w:rPr>
         <w:t xml:space="preserve">Salta: </w:t>
       </w:r>
       <w:r>
-        <w:t xml:space="preserve">El detalle de cada requerimiento funcional.</w:t>
+        <w:t xml:space="preserve">Leer cada tarjeta: basta con nombrar las capas.</w:t>
       </w:r>
     </w:p>
     <w:p>
@@ -2173,7 +2160,7 @@
         <w:spacing w:after="60" w:before="260"/>
       </w:pPr>
       <w:r>
-        <w:t xml:space="preserve">Lámina 9 · Scrum en sprints de una semana</w:t>
+        <w:t xml:space="preserve">Lámina 8 · Scrum en sprints de una semana</w:t>
       </w:r>
     </w:p>
     <w:p>
@@ -2241,7 +2228,7 @@
         <w:spacing w:after="60" w:before="260"/>
       </w:pPr>
       <w:r>
-        <w:t xml:space="preserve">Lámina 10 · Cinco sprints de construcción y dos de reserva</w:t>
+        <w:t xml:space="preserve">Lámina 9 · Cinco sprints de construcción y dos de reserva</w:t>
       </w:r>
     </w:p>
     <w:p>
@@ -2309,7 +2296,7 @@
         <w:spacing w:after="60" w:before="260"/>
       </w:pPr>
       <w:r>
-        <w:t xml:space="preserve">Lámina 11 · Un stack conocido y documentado</w:t>
+        <w:t xml:space="preserve">Lámina 10 · Un stack conocido y documentado</w:t>
       </w:r>
     </w:p>
     <w:p>
@@ -2377,7 +2364,7 @@
         <w:spacing w:after="60" w:before="260"/>
       </w:pPr>
       <w:r>
-        <w:t xml:space="preserve">Lámina 12 · Un monolito modular, con las dependencias hacia abajo</w:t>
+        <w:t xml:space="preserve">Lámina 11 · Un monolito modular, con las dependencias hacia abajo</w:t>
       </w:r>
     </w:p>
     <w:p>
@@ -2445,7 +2432,7 @@
         <w:spacing w:after="60" w:before="260"/>
       </w:pPr>
       <w:r>
-        <w:t xml:space="preserve">Lámina 13 · Todo cuelga del grupo familiar</w:t>
+        <w:t xml:space="preserve">Lámina 12 · Todo cuelga del grupo familiar</w:t>
       </w:r>
     </w:p>
     <w:p>
@@ -2513,7 +2500,7 @@
         <w:spacing w:after="60" w:before="260"/>
       </w:pPr>
       <w:r>
-        <w:t xml:space="preserve">Lámina 14 · Suscripción más despacho: 84 familias para el equilibrio</w:t>
+        <w:t xml:space="preserve">Lámina 13 · Suscripción más despacho: 84 familias para el equilibrio</w:t>
       </w:r>
     </w:p>
     <w:p>

</xml_diff>

<commit_message>
docs(fase-2): objetivo de la ficha cumplido y arquitectura simplificada
Decisiones de Jorge:
- El objetivo 3 (plan de cuidado con relevo) pasa a "Cumplido", porque
  estará listo para el viernes. El guion y la nota dicen que hay tres
  objetivos cumplidos. El objetivo 4 sigue en curso.
- Queda la arquitectura simplificada: se borra la lámina 11 original y
  la simplificada pasa a ser la 11, sin la marca de alternativa. La caja
  "Capa 3 · se puede quitar" va 0,2 in más ancha, para que el texto tenga
  aire respecto del borde punteado.
- Modelo de datos: solo "31 de 31" usa la cifra ancha. Las otras tres
  acercan su rótulo.

Vuelven a ser 17 láminas: Jorge de la 1 a la 13 y Martín de la 14 a la
17. Los tiempos no cambian (9:30).

Co-Authored-By: Claude Opus 5.5 <noreply@anthropic.com>
</commit_message>
<xml_diff>
--- a/Fase 2/Evidencias Proyecto/Guion_Jorge_Fase2.docx
+++ b/Fase 2/Evidencias Proyecto/Guion_Jorge_Fase2.docx
@@ -99,7 +99,7 @@
                 <w:bCs w:val="false"/>
                 <w:color w:val="13252A"/>
               </w:rPr>
-              <w:t xml:space="preserve">1 a 14, de la portada al modelo de negocio. Son alternativas la 11 y la 12: se presenta solo una de cada par</w:t>
+              <w:t xml:space="preserve">1 a 13, de la portada al modelo de negocio</w:t>
             </w:r>
           </w:p>
         </w:tc>
@@ -297,7 +297,7 @@
                 <w:bCs w:val="false"/>
                 <w:color w:val="13252A"/>
               </w:rPr>
-              <w:t xml:space="preserve">Martín, al final de la lámina 14: «Martín les va a mostrar MATU funcionando»</w:t>
+              <w:t xml:space="preserve">Martín, al final de la lámina 13: «Martín les va a mostrar MATU funcionando»</w:t>
             </w:r>
           </w:p>
         </w:tc>
@@ -313,7 +313,7 @@
           <w:iCs/>
           <w:color w:val="485B5F"/>
         </w:rPr>
-        <w:t xml:space="preserve">Frases cortas, para decirlas y no leerlas. La lámina muestra más de lo que dices: di lo de «Destaca» y deja que el público lea el resto. Si vas atrasado, recorta las láminas 7, 8 y 10, nunca la 3 ni la 11 o la 12.</w:t>
+        <w:t xml:space="preserve">Frases cortas, para decirlas y no leerlas. La lámina muestra más de lo que dices: di lo de «Destaca» y deja que el público lea el resto. Si vas atrasado, recorta las láminas 7, 8 y 10, nunca la 3 ni la 11.</w:t>
       </w:r>
     </w:p>
     <w:p>
@@ -1421,7 +1421,7 @@
                 <w:bCs w:val="false"/>
                 <w:color w:val="13252A"/>
               </w:rPr>
-              <w:t xml:space="preserve">11 u 12 · Un monolito modular, con las dependencias hacia abajo (alternativas)</w:t>
+              <w:t xml:space="preserve">11 · Un monolito modular, con las dependencias hacia abajo</w:t>
             </w:r>
           </w:p>
         </w:tc>
@@ -1516,7 +1516,7 @@
                 <w:bCs w:val="false"/>
                 <w:color w:val="13252A"/>
               </w:rPr>
-              <w:t xml:space="preserve">13 · Todo cuelga del grupo familiar</w:t>
+              <w:t xml:space="preserve">12 · Todo cuelga del grupo familiar</w:t>
             </w:r>
           </w:p>
         </w:tc>
@@ -1611,7 +1611,7 @@
                 <w:bCs w:val="false"/>
                 <w:color w:val="13252A"/>
               </w:rPr>
-              <w:t xml:space="preserve">14 · Suscripción más despacho: 84 familias para el equilibrio</w:t>
+              <w:t xml:space="preserve">13 · Suscripción más despacho: 84 familias para el equilibrio</w:t>
             </w:r>
           </w:p>
         </w:tc>
@@ -1978,7 +1978,7 @@
         <w:spacing w:after="120" w:line="300"/>
       </w:pPr>
       <w:r>
-        <w:t xml:space="preserve">«Son siete objetivos, cada uno con su sprint. Dos están cumplidos: la validación y el aislamiento entre familias. La ficha con su relevo tiene listos el contrato y el diseño, y la verán en la demo. El del pago cambió con el ADR-027: ahora es un solo cobro.»</w:t>
+        <w:t xml:space="preserve">«Son siete objetivos, cada uno con su sprint. Tres están cumplidos: la validación, el aislamiento entre familias y la ficha con su relevo, que verán en la demo. El del pago cambió con el ADR-027: ahora es un solo cobro.»</w:t>
       </w:r>
     </w:p>
     <w:p>
@@ -1998,7 +1998,7 @@
           <w:b/>
           <w:bCs/>
         </w:rPr>
-        <w:t xml:space="preserve">Dos cumplidos, la ficha con contrato y diseño listos, y la predicción en curso.</w:t>
+        <w:t xml:space="preserve">Tres cumplidos y la predicción en curso.</w:t>
       </w:r>
     </w:p>
     <w:p>
@@ -2082,7 +2082,7 @@
         <w:t xml:space="preserve">Salta: </w:t>
       </w:r>
       <w:r>
-        <w:t xml:space="preserve">La lista de lo que queda fuera: vuelve en la lámina 16.</w:t>
+        <w:t xml:space="preserve">La lista de lo que queda fuera: vuelve en la lámina 15.</w:t>
       </w:r>
     </w:p>
     <w:p>
@@ -2364,7 +2364,7 @@
         <w:spacing w:after="60" w:before="260"/>
       </w:pPr>
       <w:r>
-        <w:t xml:space="preserve">Lámina 11 u 12 · Un monolito modular, con las dependencias hacia abajo</w:t>
+        <w:t xml:space="preserve">Lámina 11 · Un monolito modular, con las dependencias hacia abajo</w:t>
       </w:r>
     </w:p>
     <w:p>
@@ -2379,19 +2379,6 @@
           <w:color w:val="485B5F"/>
         </w:rPr>
         <w:t xml:space="preserve">38 s · al terminar vas en 3:56</w:t>
-      </w:r>
-    </w:p>
-    <w:p>
-      <w:pPr>
-        <w:spacing w:after="120" w:line="300"/>
-      </w:pPr>
-      <w:r>
-        <w:rPr>
-          <w:i/>
-          <w:iCs/>
-          <w:color w:val="086764"/>
-        </w:rPr>
-        <w:t xml:space="preserve">Las láminas 11 y 12 son alternativas: la 12 es la versión simplificada. Se presenta solo una, con este mismo texto y el mismo tiempo.</w:t>
       </w:r>
     </w:p>
     <w:p>
@@ -2445,7 +2432,7 @@
         <w:spacing w:after="60" w:before="260"/>
       </w:pPr>
       <w:r>
-        <w:t xml:space="preserve">Lámina 13 · Todo cuelga del grupo familiar</w:t>
+        <w:t xml:space="preserve">Lámina 12 · Todo cuelga del grupo familiar</w:t>
       </w:r>
     </w:p>
     <w:p>
@@ -2513,7 +2500,7 @@
         <w:spacing w:after="60" w:before="260"/>
       </w:pPr>
       <w:r>
-        <w:t xml:space="preserve">Lámina 14 · Suscripción más despacho: 84 familias para el equilibrio</w:t>
+        <w:t xml:space="preserve">Lámina 13 · Suscripción más despacho: 84 familias para el equilibrio</w:t>
       </w:r>
     </w:p>
     <w:p>

</xml_diff>